<commit_message>
adds addtl pattern-matching figure
</commit_message>
<xml_diff>
--- a/figureCode/figureCode.docx
+++ b/figureCode/figureCode.docx
@@ -55,7 +55,7 @@
         <w:t xml:space="preserve">There is first a setup chunk which loads the appropriate packages and data.</w:t>
       </w:r>
     </w:p>
-    <w:bookmarkStart w:id="32" w:name="main-text-figures"/>
+    <w:bookmarkStart w:id="21" w:name="main-text-figures"/>
     <w:p>
       <w:pPr>
         <w:pStyle w:val="Heading1"/>
@@ -95,18 +95,18 @@
           <wp:inline>
             <wp:extent cx="5334000" cy="4445000"/>
             <wp:effectExtent b="0" l="0" r="0" t="0"/>
-            <wp:docPr descr="" title="" id="21" name="Picture"/>
+            <wp:docPr descr="" title="" id="10" name="Picture"/>
             <a:graphic>
               <a:graphicData uri="http://schemas.openxmlformats.org/drawingml/2006/picture">
                 <pic:pic>
                   <pic:nvPicPr>
-                    <pic:cNvPr descr="figureCode_files/figure-docx/figure3-1.png" id="22" name="Picture"/>
+                    <pic:cNvPr descr="figureCode_files/figure-docx/figure3-1.png" id="11" name="Picture"/>
                     <pic:cNvPicPr>
                       <a:picLocks noChangeArrowheads="1" noChangeAspect="1"/>
                     </pic:cNvPicPr>
                   </pic:nvPicPr>
                   <pic:blipFill>
-                    <a:blip r:embed="rId20"/>
+                    <a:blip r:embed="rId9"/>
                     <a:stretch>
                       <a:fillRect/>
                     </a:stretch>
@@ -215,18 +215,18 @@
           <wp:inline>
             <wp:extent cx="5334000" cy="1600200"/>
             <wp:effectExtent b="0" l="0" r="0" t="0"/>
-            <wp:docPr descr="" title="" id="24" name="Picture"/>
+            <wp:docPr descr="" title="" id="13" name="Picture"/>
             <a:graphic>
               <a:graphicData uri="http://schemas.openxmlformats.org/drawingml/2006/picture">
                 <pic:pic>
                   <pic:nvPicPr>
-                    <pic:cNvPr descr="figureCode_files/figure-docx/figure4-1.png" id="25" name="Picture"/>
+                    <pic:cNvPr descr="figureCode_files/figure-docx/figure4-1.png" id="14" name="Picture"/>
                     <pic:cNvPicPr>
                       <a:picLocks noChangeArrowheads="1" noChangeAspect="1"/>
                     </pic:cNvPicPr>
                   </pic:nvPicPr>
                   <pic:blipFill>
-                    <a:blip r:embed="rId23"/>
+                    <a:blip r:embed="rId12"/>
                     <a:stretch>
                       <a:fillRect/>
                     </a:stretch>
@@ -285,20 +285,20 @@
       <w:r>
         <w:drawing>
           <wp:inline>
-            <wp:extent cx="5334000" cy="1600200"/>
+            <wp:extent cx="5334000" cy="1454727"/>
             <wp:effectExtent b="0" l="0" r="0" t="0"/>
-            <wp:docPr descr="" title="" id="27" name="Picture"/>
+            <wp:docPr descr="" title="" id="16" name="Picture"/>
             <a:graphic>
               <a:graphicData uri="http://schemas.openxmlformats.org/drawingml/2006/picture">
                 <pic:pic>
                   <pic:nvPicPr>
-                    <pic:cNvPr descr="figureCode_files/figure-docx/figure5-1.png" id="28" name="Picture"/>
+                    <pic:cNvPr descr="figureCode_files/figure-docx/figure5-1.png" id="17" name="Picture"/>
                     <pic:cNvPicPr>
                       <a:picLocks noChangeArrowheads="1" noChangeAspect="1"/>
                     </pic:cNvPicPr>
                   </pic:nvPicPr>
                   <pic:blipFill>
-                    <a:blip r:embed="rId26"/>
+                    <a:blip r:embed="rId15"/>
                     <a:stretch>
                       <a:fillRect/>
                     </a:stretch>
@@ -306,7 +306,7 @@
                   <pic:spPr bwMode="auto">
                     <a:xfrm>
                       <a:off x="0" y="0"/>
-                      <a:ext cx="5334000" cy="1600200"/>
+                      <a:ext cx="5334000" cy="1454727"/>
                     </a:xfrm>
                     <a:prstGeom prst="rect">
                       <a:avLst/>
@@ -359,18 +359,18 @@
           <wp:inline>
             <wp:extent cx="5334000" cy="5334000"/>
             <wp:effectExtent b="0" l="0" r="0" t="0"/>
-            <wp:docPr descr="" title="" id="30" name="Picture"/>
+            <wp:docPr descr="" title="" id="19" name="Picture"/>
             <a:graphic>
               <a:graphicData uri="http://schemas.openxmlformats.org/drawingml/2006/picture">
                 <pic:pic>
                   <pic:nvPicPr>
-                    <pic:cNvPr descr="figureCode_files/figure-docx/figure6-1.png" id="31" name="Picture"/>
+                    <pic:cNvPr descr="figureCode_files/figure-docx/figure6-1.png" id="20" name="Picture"/>
                     <pic:cNvPicPr>
                       <a:picLocks noChangeArrowheads="1" noChangeAspect="1"/>
                     </pic:cNvPicPr>
                   </pic:nvPicPr>
                   <pic:blipFill>
-                    <a:blip r:embed="rId29"/>
+                    <a:blip r:embed="rId18"/>
                     <a:stretch>
                       <a:fillRect/>
                     </a:stretch>
@@ -412,19 +412,7 @@
         <w:t xml:space="preserve"> </w:t>
       </w:r>
       <w:r>
-        <w:t xml:space="preserve">The relationship between group size and foraging efficiency, mediated by the maximum distance that agents would tolerate being from group members (</w:t>
-      </w:r>
-      <w:r>
-        <w:t xml:space="preserve">“target distance”</w:t>
-      </w:r>
-      <w:r>
-        <w:t xml:space="preserve">). The number of group members that each agent attempted to keep in proximity (</w:t>
-      </w:r>
-      <w:r>
-        <w:t xml:space="preserve">“target neighbors”</w:t>
-      </w:r>
-      <w:r>
-        <w:t xml:space="preserve">) was also allowed to vary across these simulations. Each dot represents a population mean of a single simulation. The black lines are linear regressions for each category of target distance. Formulae for the regression lines (using the log group size) are displayed on each plot.</w:t>
+        <w:t xml:space="preserve">The relationship between group size and foraging efficiency, mediated by the maximum distance that agents would tolerate being from group members (“target distance”). The number of group members that each agent attempted to keep in proximity (“target neighbors”) was also allowed to vary across these simulations. Each dot represents a population mean of a single simulation. The black lines are linear regressions for each category of target distance. Formulae for the regression lines (using the log group size) are displayed on each plot.</w:t>
       </w:r>
       <w:r>
         <w:t xml:space="preserve"> </w:t>
@@ -466,8 +454,8 @@
         </w:pict>
       </w:r>
     </w:p>
-    <w:bookmarkEnd w:id="32"/>
-    <w:bookmarkStart w:id="63" w:name="supplementappendix-2"/>
+    <w:bookmarkEnd w:id="21"/>
+    <w:bookmarkStart w:id="55" w:name="supplementappendix-2"/>
     <w:p>
       <w:pPr>
         <w:pStyle w:val="Heading1"/>
@@ -483,28 +471,73 @@
       <w:r>
         <w:t xml:space="preserve">This supplement/appendix contains extra results to support the main text.</w:t>
       </w:r>
-    </w:p>
-    <w:p>
-      <w:pPr>
-        <w:pStyle w:val="BodyText"/>
-      </w:pPr>
+      <w:r>
+        <w:t xml:space="preserve"> </w:t>
+      </w:r>
       <w:r>
         <w:drawing>
           <wp:inline>
-            <wp:extent cx="5334000" cy="2667000"/>
+            <wp:extent cx="5334000" cy="4445000"/>
             <wp:effectExtent b="0" l="0" r="0" t="0"/>
-            <wp:docPr descr="" title="" id="34" name="Picture"/>
+            <wp:docPr descr="" title="" id="23" name="Picture"/>
             <a:graphic>
               <a:graphicData uri="http://schemas.openxmlformats.org/drawingml/2006/picture">
                 <pic:pic>
                   <pic:nvPicPr>
-                    <pic:cNvPr descr="figureCode_files/figure-docx/figure2.2-1.png" id="35" name="Picture"/>
+                    <pic:cNvPr descr="figureCode_files/figure-docx/figure2.1-1.png" id="24" name="Picture"/>
                     <pic:cNvPicPr>
                       <a:picLocks noChangeArrowheads="1" noChangeAspect="1"/>
                     </pic:cNvPicPr>
                   </pic:nvPicPr>
                   <pic:blipFill>
-                    <a:blip r:embed="rId33"/>
+                    <a:blip r:embed="rId22"/>
+                    <a:stretch>
+                      <a:fillRect/>
+                    </a:stretch>
+                  </pic:blipFill>
+                  <pic:spPr bwMode="auto">
+                    <a:xfrm>
+                      <a:off x="0" y="0"/>
+                      <a:ext cx="5334000" cy="4445000"/>
+                    </a:xfrm>
+                    <a:prstGeom prst="rect">
+                      <a:avLst/>
+                    </a:prstGeom>
+                    <a:noFill/>
+                    <a:ln w="9525">
+                      <a:noFill/>
+                      <a:headEnd/>
+                      <a:tailEnd/>
+                    </a:ln>
+                  </pic:spPr>
+                </pic:pic>
+              </a:graphicData>
+            </a:graphic>
+          </wp:inline>
+        </w:drawing>
+      </w:r>
+    </w:p>
+    <w:p>
+      <w:pPr>
+        <w:pStyle w:val="BodyText"/>
+      </w:pPr>
+      <w:r>
+        <w:drawing>
+          <wp:inline>
+            <wp:extent cx="5334000" cy="2667000"/>
+            <wp:effectExtent b="0" l="0" r="0" t="0"/>
+            <wp:docPr descr="" title="" id="26" name="Picture"/>
+            <a:graphic>
+              <a:graphicData uri="http://schemas.openxmlformats.org/drawingml/2006/picture">
+                <pic:pic>
+                  <pic:nvPicPr>
+                    <pic:cNvPr descr="figureCode_files/figure-docx/figure2.2-1.png" id="27" name="Picture"/>
+                    <pic:cNvPicPr>
+                      <a:picLocks noChangeArrowheads="1" noChangeAspect="1"/>
+                    </pic:cNvPicPr>
+                  </pic:nvPicPr>
+                  <pic:blipFill>
+                    <a:blip r:embed="rId25"/>
                     <a:stretch>
                       <a:fillRect/>
                     </a:stretch>
@@ -565,18 +598,18 @@
           <wp:inline>
             <wp:extent cx="5334000" cy="2667000"/>
             <wp:effectExtent b="0" l="0" r="0" t="0"/>
-            <wp:docPr descr="" title="" id="37" name="Picture"/>
+            <wp:docPr descr="" title="" id="29" name="Picture"/>
             <a:graphic>
               <a:graphicData uri="http://schemas.openxmlformats.org/drawingml/2006/picture">
                 <pic:pic>
                   <pic:nvPicPr>
-                    <pic:cNvPr descr="figureCode_files/figure-docx/figure2.3-1.png" id="38" name="Picture"/>
+                    <pic:cNvPr descr="figureCode_files/figure-docx/figure2.3-1.png" id="30" name="Picture"/>
                     <pic:cNvPicPr>
                       <a:picLocks noChangeArrowheads="1" noChangeAspect="1"/>
                     </pic:cNvPicPr>
                   </pic:nvPicPr>
                   <pic:blipFill>
-                    <a:blip r:embed="rId36"/>
+                    <a:blip r:embed="rId28"/>
                     <a:stretch>
                       <a:fillRect/>
                     </a:stretch>
@@ -637,18 +670,18 @@
           <wp:inline>
             <wp:extent cx="4013200" cy="2438400"/>
             <wp:effectExtent b="0" l="0" r="0" t="0"/>
-            <wp:docPr descr="" title="" id="40" name="Picture"/>
+            <wp:docPr descr="" title="" id="32" name="Picture"/>
             <a:graphic>
               <a:graphicData uri="http://schemas.openxmlformats.org/drawingml/2006/picture">
                 <pic:pic>
                   <pic:nvPicPr>
-                    <pic:cNvPr descr="figureCode_files/figure-docx/figure2.4-1.png" id="41" name="Picture"/>
+                    <pic:cNvPr descr="figureCode_files/figure-docx/figure2.4-1.png" id="33" name="Picture"/>
                     <pic:cNvPicPr>
                       <a:picLocks noChangeArrowheads="1" noChangeAspect="1"/>
                     </pic:cNvPicPr>
                   </pic:nvPicPr>
                   <pic:blipFill>
-                    <a:blip r:embed="rId39"/>
+                    <a:blip r:embed="rId31"/>
                     <a:stretch>
                       <a:fillRect/>
                     </a:stretch>
@@ -709,18 +742,18 @@
           <wp:inline>
             <wp:extent cx="5334000" cy="5334000"/>
             <wp:effectExtent b="0" l="0" r="0" t="0"/>
-            <wp:docPr descr="" title="" id="43" name="Picture"/>
+            <wp:docPr descr="" title="" id="35" name="Picture"/>
             <a:graphic>
               <a:graphicData uri="http://schemas.openxmlformats.org/drawingml/2006/picture">
                 <pic:pic>
                   <pic:nvPicPr>
-                    <pic:cNvPr descr="figureCode_files/figure-docx/figure2.5-1.png" id="44" name="Picture"/>
+                    <pic:cNvPr descr="figureCode_files/figure-docx/figure2.5-1.png" id="36" name="Picture"/>
                     <pic:cNvPicPr>
                       <a:picLocks noChangeArrowheads="1" noChangeAspect="1"/>
                     </pic:cNvPicPr>
                   </pic:nvPicPr>
                   <pic:blipFill>
-                    <a:blip r:embed="rId42"/>
+                    <a:blip r:embed="rId34"/>
                     <a:stretch>
                       <a:fillRect/>
                     </a:stretch>
@@ -781,18 +814,18 @@
           <wp:inline>
             <wp:extent cx="5334000" cy="9144000"/>
             <wp:effectExtent b="0" l="0" r="0" t="0"/>
-            <wp:docPr descr="" title="" id="46" name="Picture"/>
+            <wp:docPr descr="" title="" id="38" name="Picture"/>
             <a:graphic>
               <a:graphicData uri="http://schemas.openxmlformats.org/drawingml/2006/picture">
                 <pic:pic>
                   <pic:nvPicPr>
-                    <pic:cNvPr descr="figureCode_files/figure-docx/figure2.6-1.png" id="47" name="Picture"/>
+                    <pic:cNvPr descr="figureCode_files/figure-docx/figure2.6-1.png" id="39" name="Picture"/>
                     <pic:cNvPicPr>
                       <a:picLocks noChangeArrowheads="1" noChangeAspect="1"/>
                     </pic:cNvPicPr>
                   </pic:nvPicPr>
                   <pic:blipFill>
-                    <a:blip r:embed="rId45"/>
+                    <a:blip r:embed="rId37"/>
                     <a:stretch>
                       <a:fillRect/>
                     </a:stretch>
@@ -853,18 +886,18 @@
           <wp:inline>
             <wp:extent cx="5334000" cy="6096000"/>
             <wp:effectExtent b="0" l="0" r="0" t="0"/>
-            <wp:docPr descr="" title="" id="49" name="Picture"/>
+            <wp:docPr descr="" title="" id="41" name="Picture"/>
             <a:graphic>
               <a:graphicData uri="http://schemas.openxmlformats.org/drawingml/2006/picture">
                 <pic:pic>
                   <pic:nvPicPr>
-                    <pic:cNvPr descr="figureCode_files/figure-docx/figure2.7-1.png" id="50" name="Picture"/>
+                    <pic:cNvPr descr="figureCode_files/figure-docx/figure2.7-1.png" id="42" name="Picture"/>
                     <pic:cNvPicPr>
                       <a:picLocks noChangeArrowheads="1" noChangeAspect="1"/>
                     </pic:cNvPicPr>
                   </pic:nvPicPr>
                   <pic:blipFill>
-                    <a:blip r:embed="rId48"/>
+                    <a:blip r:embed="rId40"/>
                     <a:stretch>
                       <a:fillRect/>
                     </a:stretch>
@@ -925,18 +958,18 @@
           <wp:inline>
             <wp:extent cx="5334000" cy="8382000"/>
             <wp:effectExtent b="0" l="0" r="0" t="0"/>
-            <wp:docPr descr="" title="" id="52" name="Picture"/>
+            <wp:docPr descr="" title="" id="44" name="Picture"/>
             <a:graphic>
               <a:graphicData uri="http://schemas.openxmlformats.org/drawingml/2006/picture">
                 <pic:pic>
                   <pic:nvPicPr>
-                    <pic:cNvPr descr="figureCode_files/figure-docx/figure2.8-1.png" id="53" name="Picture"/>
+                    <pic:cNvPr descr="figureCode_files/figure-docx/figure2.8-1.png" id="45" name="Picture"/>
                     <pic:cNvPicPr>
                       <a:picLocks noChangeArrowheads="1" noChangeAspect="1"/>
                     </pic:cNvPicPr>
                   </pic:nvPicPr>
                   <pic:blipFill>
-                    <a:blip r:embed="rId51"/>
+                    <a:blip r:embed="rId43"/>
                     <a:stretch>
                       <a:fillRect/>
                     </a:stretch>
@@ -997,18 +1030,18 @@
           <wp:inline>
             <wp:extent cx="5334000" cy="9144000"/>
             <wp:effectExtent b="0" l="0" r="0" t="0"/>
-            <wp:docPr descr="" title="" id="55" name="Picture"/>
+            <wp:docPr descr="" title="" id="47" name="Picture"/>
             <a:graphic>
               <a:graphicData uri="http://schemas.openxmlformats.org/drawingml/2006/picture">
                 <pic:pic>
                   <pic:nvPicPr>
-                    <pic:cNvPr descr="figureCode_files/figure-docx/figure2.9-1.png" id="56" name="Picture"/>
+                    <pic:cNvPr descr="figureCode_files/figure-docx/figure2.9-1.png" id="48" name="Picture"/>
                     <pic:cNvPicPr>
                       <a:picLocks noChangeArrowheads="1" noChangeAspect="1"/>
                     </pic:cNvPicPr>
                   </pic:nvPicPr>
                   <pic:blipFill>
-                    <a:blip r:embed="rId54"/>
+                    <a:blip r:embed="rId46"/>
                     <a:stretch>
                       <a:fillRect/>
                     </a:stretch>
@@ -1069,18 +1102,18 @@
           <wp:inline>
             <wp:extent cx="5334000" cy="9144000"/>
             <wp:effectExtent b="0" l="0" r="0" t="0"/>
-            <wp:docPr descr="" title="" id="58" name="Picture"/>
+            <wp:docPr descr="" title="" id="50" name="Picture"/>
             <a:graphic>
               <a:graphicData uri="http://schemas.openxmlformats.org/drawingml/2006/picture">
                 <pic:pic>
                   <pic:nvPicPr>
-                    <pic:cNvPr descr="figureCode_files/figure-docx/figure2.10-1.png" id="59" name="Picture"/>
+                    <pic:cNvPr descr="figureCode_files/figure-docx/figure2.10-1.png" id="51" name="Picture"/>
                     <pic:cNvPicPr>
                       <a:picLocks noChangeArrowheads="1" noChangeAspect="1"/>
                     </pic:cNvPicPr>
                   </pic:nvPicPr>
                   <pic:blipFill>
-                    <a:blip r:embed="rId57"/>
+                    <a:blip r:embed="rId49"/>
                     <a:stretch>
                       <a:fillRect/>
                     </a:stretch>
@@ -1141,18 +1174,18 @@
           <wp:inline>
             <wp:extent cx="5334000" cy="7620000"/>
             <wp:effectExtent b="0" l="0" r="0" t="0"/>
-            <wp:docPr descr="" title="" id="61" name="Picture"/>
+            <wp:docPr descr="" title="" id="53" name="Picture"/>
             <a:graphic>
               <a:graphicData uri="http://schemas.openxmlformats.org/drawingml/2006/picture">
                 <pic:pic>
                   <pic:nvPicPr>
-                    <pic:cNvPr descr="figureCode_files/figure-docx/figure2.11-1.png" id="62" name="Picture"/>
+                    <pic:cNvPr descr="figureCode_files/figure-docx/figure2.11-1.png" id="54" name="Picture"/>
                     <pic:cNvPicPr>
                       <a:picLocks noChangeArrowheads="1" noChangeAspect="1"/>
                     </pic:cNvPicPr>
                   </pic:nvPicPr>
                   <pic:blipFill>
-                    <a:blip r:embed="rId60"/>
+                    <a:blip r:embed="rId52"/>
                     <a:stretch>
                       <a:fillRect/>
                     </a:stretch>
@@ -1204,8 +1237,8 @@
         </w:pict>
       </w:r>
     </w:p>
-    <w:bookmarkEnd w:id="63"/>
-    <w:bookmarkStart w:id="67" w:name="supplementappendix-3"/>
+    <w:bookmarkEnd w:id="55"/>
+    <w:bookmarkStart w:id="68" w:name="supplementappendix-3"/>
     <w:p>
       <w:pPr>
         <w:pStyle w:val="Heading1"/>
@@ -1231,18 +1264,18 @@
           <wp:inline>
             <wp:extent cx="5334000" cy="10668000"/>
             <wp:effectExtent b="0" l="0" r="0" t="0"/>
-            <wp:docPr descr="" title="" id="65" name="Picture"/>
+            <wp:docPr descr="" title="" id="57" name="Picture"/>
             <a:graphic>
               <a:graphicData uri="http://schemas.openxmlformats.org/drawingml/2006/picture">
                 <pic:pic>
                   <pic:nvPicPr>
-                    <pic:cNvPr descr="figureCode_files/figure-docx/figure3.1-1.png" id="66" name="Picture"/>
+                    <pic:cNvPr descr="figureCode_files/figure-docx/figure3.1-1.png" id="58" name="Picture"/>
                     <pic:cNvPicPr>
                       <a:picLocks noChangeArrowheads="1" noChangeAspect="1"/>
                     </pic:cNvPicPr>
                   </pic:nvPicPr>
                   <pic:blipFill>
-                    <a:blip r:embed="rId64"/>
+                    <a:blip r:embed="rId56"/>
                     <a:stretch>
                       <a:fillRect/>
                     </a:stretch>
@@ -1670,7 +1703,148 @@
         </w:tc>
       </w:tr>
     </w:tbl>
-    <w:bookmarkEnd w:id="67"/>
+    <w:p>
+      <w:pPr>
+        <w:pStyle w:val="BodyText"/>
+      </w:pPr>
+      <w:r>
+        <w:drawing>
+          <wp:inline>
+            <wp:extent cx="5334000" cy="1600200"/>
+            <wp:effectExtent b="0" l="0" r="0" t="0"/>
+            <wp:docPr descr="" title="" id="60" name="Picture"/>
+            <a:graphic>
+              <a:graphicData uri="http://schemas.openxmlformats.org/drawingml/2006/picture">
+                <pic:pic>
+                  <pic:nvPicPr>
+                    <pic:cNvPr descr="figureCode_files/figure-docx/pptFigures1-1.png" id="61" name="Picture"/>
+                    <pic:cNvPicPr>
+                      <a:picLocks noChangeArrowheads="1" noChangeAspect="1"/>
+                    </pic:cNvPicPr>
+                  </pic:nvPicPr>
+                  <pic:blipFill>
+                    <a:blip r:embed="rId59"/>
+                    <a:stretch>
+                      <a:fillRect/>
+                    </a:stretch>
+                  </pic:blipFill>
+                  <pic:spPr bwMode="auto">
+                    <a:xfrm>
+                      <a:off x="0" y="0"/>
+                      <a:ext cx="5334000" cy="1600200"/>
+                    </a:xfrm>
+                    <a:prstGeom prst="rect">
+                      <a:avLst/>
+                    </a:prstGeom>
+                    <a:noFill/>
+                    <a:ln w="9525">
+                      <a:noFill/>
+                      <a:headEnd/>
+                      <a:tailEnd/>
+                    </a:ln>
+                  </pic:spPr>
+                </pic:pic>
+              </a:graphicData>
+            </a:graphic>
+          </wp:inline>
+        </w:drawing>
+      </w:r>
+    </w:p>
+    <w:p>
+      <w:pPr>
+        <w:pStyle w:val="BodyText"/>
+      </w:pPr>
+      <w:r>
+        <w:drawing>
+          <wp:inline>
+            <wp:extent cx="5334000" cy="1454727"/>
+            <wp:effectExtent b="0" l="0" r="0" t="0"/>
+            <wp:docPr descr="" title="" id="63" name="Picture"/>
+            <a:graphic>
+              <a:graphicData uri="http://schemas.openxmlformats.org/drawingml/2006/picture">
+                <pic:pic>
+                  <pic:nvPicPr>
+                    <pic:cNvPr descr="figureCode_files/figure-docx/pptFigure2-1.png" id="64" name="Picture"/>
+                    <pic:cNvPicPr>
+                      <a:picLocks noChangeArrowheads="1" noChangeAspect="1"/>
+                    </pic:cNvPicPr>
+                  </pic:nvPicPr>
+                  <pic:blipFill>
+                    <a:blip r:embed="rId62"/>
+                    <a:stretch>
+                      <a:fillRect/>
+                    </a:stretch>
+                  </pic:blipFill>
+                  <pic:spPr bwMode="auto">
+                    <a:xfrm>
+                      <a:off x="0" y="0"/>
+                      <a:ext cx="5334000" cy="1454727"/>
+                    </a:xfrm>
+                    <a:prstGeom prst="rect">
+                      <a:avLst/>
+                    </a:prstGeom>
+                    <a:noFill/>
+                    <a:ln w="9525">
+                      <a:noFill/>
+                      <a:headEnd/>
+                      <a:tailEnd/>
+                    </a:ln>
+                  </pic:spPr>
+                </pic:pic>
+              </a:graphicData>
+            </a:graphic>
+          </wp:inline>
+        </w:drawing>
+      </w:r>
+    </w:p>
+    <w:p>
+      <w:pPr>
+        <w:pStyle w:val="BodyText"/>
+      </w:pPr>
+      <w:r>
+        <w:drawing>
+          <wp:inline>
+            <wp:extent cx="5334000" cy="2133600"/>
+            <wp:effectExtent b="0" l="0" r="0" t="0"/>
+            <wp:docPr descr="" title="" id="66" name="Picture"/>
+            <a:graphic>
+              <a:graphicData uri="http://schemas.openxmlformats.org/drawingml/2006/picture">
+                <pic:pic>
+                  <pic:nvPicPr>
+                    <pic:cNvPr descr="figureCode_files/figure-docx/pptFigure3-1.png" id="67" name="Picture"/>
+                    <pic:cNvPicPr>
+                      <a:picLocks noChangeArrowheads="1" noChangeAspect="1"/>
+                    </pic:cNvPicPr>
+                  </pic:nvPicPr>
+                  <pic:blipFill>
+                    <a:blip r:embed="rId65"/>
+                    <a:stretch>
+                      <a:fillRect/>
+                    </a:stretch>
+                  </pic:blipFill>
+                  <pic:spPr bwMode="auto">
+                    <a:xfrm>
+                      <a:off x="0" y="0"/>
+                      <a:ext cx="5334000" cy="2133600"/>
+                    </a:xfrm>
+                    <a:prstGeom prst="rect">
+                      <a:avLst/>
+                    </a:prstGeom>
+                    <a:noFill/>
+                    <a:ln w="9525">
+                      <a:noFill/>
+                      <a:headEnd/>
+                      <a:tailEnd/>
+                    </a:ln>
+                  </pic:spPr>
+                </pic:pic>
+              </a:graphicData>
+            </a:graphic>
+          </wp:inline>
+        </w:drawing>
+      </w:r>
+    </w:p>
+    <w:bookmarkEnd w:id="68"/>
     <w:sectPr>
       <w:footnotePr>
         <w:numRestart w:val="eachSect"/>
@@ -1792,10 +1966,10 @@
   <w:docDefaults>
     <w:rPrDefault>
       <w:rPr>
-        <w:rFonts w:asciiTheme="minorHAnsi" w:cstheme="minorBidi" w:eastAsiaTheme="minorHAnsi" w:hAnsiTheme="minorHAnsi"/>
+        <w:rFonts w:asciiTheme="minorHAnsi" w:cstheme="minorBidi" w:eastAsiaTheme="minorEastAsia" w:hAnsiTheme="minorHAnsi"/>
         <w:sz w:val="24"/>
         <w:szCs w:val="24"/>
-        <w:lang w:bidi="ar-SA" w:eastAsia="en-US" w:val="en-US"/>
+        <w:lang w:bidi="ar-SA" w:eastAsia="zh-CN" w:val="en-US"/>
       </w:rPr>
     </w:rPrDefault>
     <w:pPrDefault>
@@ -2336,13 +2510,6 @@
       </w:tblCellMar>
     </w:tblPr>
     <w:tblStylePr w:type="firstRow">
-      <w:tblPr>
-        <w:jc w:val="left"/>
-        <w:tblInd w:type="dxa" w:w="0"/>
-      </w:tblPr>
-      <w:trPr>
-        <w:jc w:val="left"/>
-      </w:trPr>
       <w:tcPr>
         <w:tcBorders>
           <w:bottom w:val="single"/>

</xml_diff>